<commit_message>
Update Group 12: update README with earning model, and add GitHub repository link
</commit_message>
<xml_diff>
--- a/AJP assigment list.docx
+++ b/AJP assigment list.docx
@@ -432,11 +432,6 @@
     <w:p>
       <w:r>
         <w:t xml:space="preserve">Ankit Kumar </w:t>
-      </w:r>
-    </w:p>
-    <w:p>
-      <w:r>
-        <w:t xml:space="preserve">Ayush Khuntiya </w:t>
       </w:r>
     </w:p>
     <w:p>

</xml_diff>